<commit_message>
Week 8 - Ocean Blue UI redesign complete with structured notes display
</commit_message>
<xml_diff>
--- a/AI_Lecture_Notes_Generator_Report.docx
+++ b/AI_Lecture_Notes_Generator_Report.docx
@@ -4683,6 +4683,7 @@
             </w:tabs>
             <w:rPr>
               <w:noProof/>
+              <w:color w:val="EE0000"/>
             </w:rPr>
           </w:pPr>
           <w:hyperlink w:anchor="_Toc232372185" w:history="1">
@@ -5654,12 +5655,6 @@
         <w:gridCol w:w="7960"/>
       </w:tblGrid>
       <w:tr>
-        <w:tblPrEx>
-          <w:tblCellMar>
-            <w:top w:w="0" w:type="dxa"/>
-            <w:bottom w:w="0" w:type="dxa"/>
-          </w:tblCellMar>
-        </w:tblPrEx>
         <w:tc>
           <w:tcPr>
             <w:tcW w:w="1400" w:type="dxa"/>
@@ -5720,12 +5715,6 @@
         </w:tc>
       </w:tr>
       <w:tr>
-        <w:tblPrEx>
-          <w:tblCellMar>
-            <w:top w:w="0" w:type="dxa"/>
-            <w:bottom w:w="0" w:type="dxa"/>
-          </w:tblCellMar>
-        </w:tblPrEx>
         <w:tc>
           <w:tcPr>
             <w:tcW w:w="1400" w:type="dxa"/>
@@ -5782,12 +5771,6 @@
         </w:tc>
       </w:tr>
       <w:tr>
-        <w:tblPrEx>
-          <w:tblCellMar>
-            <w:top w:w="0" w:type="dxa"/>
-            <w:bottom w:w="0" w:type="dxa"/>
-          </w:tblCellMar>
-        </w:tblPrEx>
         <w:tc>
           <w:tcPr>
             <w:tcW w:w="1400" w:type="dxa"/>
@@ -5844,12 +5827,6 @@
         </w:tc>
       </w:tr>
       <w:tr>
-        <w:tblPrEx>
-          <w:tblCellMar>
-            <w:top w:w="0" w:type="dxa"/>
-            <w:bottom w:w="0" w:type="dxa"/>
-          </w:tblCellMar>
-        </w:tblPrEx>
         <w:tc>
           <w:tcPr>
             <w:tcW w:w="1400" w:type="dxa"/>
@@ -5906,12 +5883,6 @@
         </w:tc>
       </w:tr>
       <w:tr>
-        <w:tblPrEx>
-          <w:tblCellMar>
-            <w:top w:w="0" w:type="dxa"/>
-            <w:bottom w:w="0" w:type="dxa"/>
-          </w:tblCellMar>
-        </w:tblPrEx>
         <w:tc>
           <w:tcPr>
             <w:tcW w:w="1400" w:type="dxa"/>
@@ -5968,12 +5939,6 @@
         </w:tc>
       </w:tr>
       <w:tr>
-        <w:tblPrEx>
-          <w:tblCellMar>
-            <w:top w:w="0" w:type="dxa"/>
-            <w:bottom w:w="0" w:type="dxa"/>
-          </w:tblCellMar>
-        </w:tblPrEx>
         <w:tc>
           <w:tcPr>
             <w:tcW w:w="1400" w:type="dxa"/>
@@ -6030,12 +5995,6 @@
         </w:tc>
       </w:tr>
       <w:tr>
-        <w:tblPrEx>
-          <w:tblCellMar>
-            <w:top w:w="0" w:type="dxa"/>
-            <w:bottom w:w="0" w:type="dxa"/>
-          </w:tblCellMar>
-        </w:tblPrEx>
         <w:tc>
           <w:tcPr>
             <w:tcW w:w="1400" w:type="dxa"/>
@@ -6092,12 +6051,6 @@
         </w:tc>
       </w:tr>
       <w:tr>
-        <w:tblPrEx>
-          <w:tblCellMar>
-            <w:top w:w="0" w:type="dxa"/>
-            <w:bottom w:w="0" w:type="dxa"/>
-          </w:tblCellMar>
-        </w:tblPrEx>
         <w:tc>
           <w:tcPr>
             <w:tcW w:w="1400" w:type="dxa"/>
@@ -6154,12 +6107,6 @@
         </w:tc>
       </w:tr>
       <w:tr>
-        <w:tblPrEx>
-          <w:tblCellMar>
-            <w:top w:w="0" w:type="dxa"/>
-            <w:bottom w:w="0" w:type="dxa"/>
-          </w:tblCellMar>
-        </w:tblPrEx>
         <w:tc>
           <w:tcPr>
             <w:tcW w:w="1400" w:type="dxa"/>
@@ -6216,12 +6163,6 @@
         </w:tc>
       </w:tr>
       <w:tr>
-        <w:tblPrEx>
-          <w:tblCellMar>
-            <w:top w:w="0" w:type="dxa"/>
-            <w:bottom w:w="0" w:type="dxa"/>
-          </w:tblCellMar>
-        </w:tblPrEx>
         <w:tc>
           <w:tcPr>
             <w:tcW w:w="1400" w:type="dxa"/>
@@ -6278,12 +6219,6 @@
         </w:tc>
       </w:tr>
       <w:tr>
-        <w:tblPrEx>
-          <w:tblCellMar>
-            <w:top w:w="0" w:type="dxa"/>
-            <w:bottom w:w="0" w:type="dxa"/>
-          </w:tblCellMar>
-        </w:tblPrEx>
         <w:tc>
           <w:tcPr>
             <w:tcW w:w="1400" w:type="dxa"/>
@@ -6378,12 +6313,6 @@
         <w:gridCol w:w="7960"/>
       </w:tblGrid>
       <w:tr>
-        <w:tblPrEx>
-          <w:tblCellMar>
-            <w:top w:w="0" w:type="dxa"/>
-            <w:bottom w:w="0" w:type="dxa"/>
-          </w:tblCellMar>
-        </w:tblPrEx>
         <w:tc>
           <w:tcPr>
             <w:tcW w:w="1400" w:type="dxa"/>
@@ -6444,12 +6373,6 @@
         </w:tc>
       </w:tr>
       <w:tr>
-        <w:tblPrEx>
-          <w:tblCellMar>
-            <w:top w:w="0" w:type="dxa"/>
-            <w:bottom w:w="0" w:type="dxa"/>
-          </w:tblCellMar>
-        </w:tblPrEx>
         <w:tc>
           <w:tcPr>
             <w:tcW w:w="1400" w:type="dxa"/>
@@ -6506,12 +6429,6 @@
         </w:tc>
       </w:tr>
       <w:tr>
-        <w:tblPrEx>
-          <w:tblCellMar>
-            <w:top w:w="0" w:type="dxa"/>
-            <w:bottom w:w="0" w:type="dxa"/>
-          </w:tblCellMar>
-        </w:tblPrEx>
         <w:tc>
           <w:tcPr>
             <w:tcW w:w="1400" w:type="dxa"/>
@@ -6568,12 +6485,6 @@
         </w:tc>
       </w:tr>
       <w:tr>
-        <w:tblPrEx>
-          <w:tblCellMar>
-            <w:top w:w="0" w:type="dxa"/>
-            <w:bottom w:w="0" w:type="dxa"/>
-          </w:tblCellMar>
-        </w:tblPrEx>
         <w:tc>
           <w:tcPr>
             <w:tcW w:w="1400" w:type="dxa"/>
@@ -6630,12 +6541,6 @@
         </w:tc>
       </w:tr>
       <w:tr>
-        <w:tblPrEx>
-          <w:tblCellMar>
-            <w:top w:w="0" w:type="dxa"/>
-            <w:bottom w:w="0" w:type="dxa"/>
-          </w:tblCellMar>
-        </w:tblPrEx>
         <w:tc>
           <w:tcPr>
             <w:tcW w:w="1400" w:type="dxa"/>
@@ -6692,12 +6597,6 @@
         </w:tc>
       </w:tr>
       <w:tr>
-        <w:tblPrEx>
-          <w:tblCellMar>
-            <w:top w:w="0" w:type="dxa"/>
-            <w:bottom w:w="0" w:type="dxa"/>
-          </w:tblCellMar>
-        </w:tblPrEx>
         <w:tc>
           <w:tcPr>
             <w:tcW w:w="1400" w:type="dxa"/>
@@ -6754,12 +6653,6 @@
         </w:tc>
       </w:tr>
       <w:tr>
-        <w:tblPrEx>
-          <w:tblCellMar>
-            <w:top w:w="0" w:type="dxa"/>
-            <w:bottom w:w="0" w:type="dxa"/>
-          </w:tblCellMar>
-        </w:tblPrEx>
         <w:tc>
           <w:tcPr>
             <w:tcW w:w="1400" w:type="dxa"/>
@@ -6816,12 +6709,6 @@
         </w:tc>
       </w:tr>
       <w:tr>
-        <w:tblPrEx>
-          <w:tblCellMar>
-            <w:top w:w="0" w:type="dxa"/>
-            <w:bottom w:w="0" w:type="dxa"/>
-          </w:tblCellMar>
-        </w:tblPrEx>
         <w:tc>
           <w:tcPr>
             <w:tcW w:w="1400" w:type="dxa"/>
@@ -7330,12 +7217,6 @@
         <w:gridCol w:w="6060"/>
       </w:tblGrid>
       <w:tr>
-        <w:tblPrEx>
-          <w:tblCellMar>
-            <w:top w:w="0" w:type="dxa"/>
-            <w:bottom w:w="0" w:type="dxa"/>
-          </w:tblCellMar>
-        </w:tblPrEx>
         <w:tc>
           <w:tcPr>
             <w:tcW w:w="3300" w:type="dxa"/>
@@ -7396,12 +7277,6 @@
         </w:tc>
       </w:tr>
       <w:tr>
-        <w:tblPrEx>
-          <w:tblCellMar>
-            <w:top w:w="0" w:type="dxa"/>
-            <w:bottom w:w="0" w:type="dxa"/>
-          </w:tblCellMar>
-        </w:tblPrEx>
         <w:tc>
           <w:tcPr>
             <w:tcW w:w="3300" w:type="dxa"/>
@@ -7458,12 +7333,6 @@
         </w:tc>
       </w:tr>
       <w:tr>
-        <w:tblPrEx>
-          <w:tblCellMar>
-            <w:top w:w="0" w:type="dxa"/>
-            <w:bottom w:w="0" w:type="dxa"/>
-          </w:tblCellMar>
-        </w:tblPrEx>
         <w:tc>
           <w:tcPr>
             <w:tcW w:w="3300" w:type="dxa"/>
@@ -7520,12 +7389,6 @@
         </w:tc>
       </w:tr>
       <w:tr>
-        <w:tblPrEx>
-          <w:tblCellMar>
-            <w:top w:w="0" w:type="dxa"/>
-            <w:bottom w:w="0" w:type="dxa"/>
-          </w:tblCellMar>
-        </w:tblPrEx>
         <w:tc>
           <w:tcPr>
             <w:tcW w:w="3300" w:type="dxa"/>
@@ -7582,12 +7445,6 @@
         </w:tc>
       </w:tr>
       <w:tr>
-        <w:tblPrEx>
-          <w:tblCellMar>
-            <w:top w:w="0" w:type="dxa"/>
-            <w:bottom w:w="0" w:type="dxa"/>
-          </w:tblCellMar>
-        </w:tblPrEx>
         <w:tc>
           <w:tcPr>
             <w:tcW w:w="3300" w:type="dxa"/>
@@ -7652,12 +7509,6 @@
         </w:tc>
       </w:tr>
       <w:tr>
-        <w:tblPrEx>
-          <w:tblCellMar>
-            <w:top w:w="0" w:type="dxa"/>
-            <w:bottom w:w="0" w:type="dxa"/>
-          </w:tblCellMar>
-        </w:tblPrEx>
         <w:tc>
           <w:tcPr>
             <w:tcW w:w="3300" w:type="dxa"/>
@@ -7744,12 +7595,6 @@
         </w:tc>
       </w:tr>
       <w:tr>
-        <w:tblPrEx>
-          <w:tblCellMar>
-            <w:top w:w="0" w:type="dxa"/>
-            <w:bottom w:w="0" w:type="dxa"/>
-          </w:tblCellMar>
-        </w:tblPrEx>
         <w:tc>
           <w:tcPr>
             <w:tcW w:w="3300" w:type="dxa"/>
@@ -7808,12 +7653,6 @@
         </w:tc>
       </w:tr>
       <w:tr>
-        <w:tblPrEx>
-          <w:tblCellMar>
-            <w:top w:w="0" w:type="dxa"/>
-            <w:bottom w:w="0" w:type="dxa"/>
-          </w:tblCellMar>
-        </w:tblPrEx>
         <w:tc>
           <w:tcPr>
             <w:tcW w:w="3300" w:type="dxa"/>
@@ -7872,12 +7711,6 @@
         </w:tc>
       </w:tr>
       <w:tr>
-        <w:tblPrEx>
-          <w:tblCellMar>
-            <w:top w:w="0" w:type="dxa"/>
-            <w:bottom w:w="0" w:type="dxa"/>
-          </w:tblCellMar>
-        </w:tblPrEx>
         <w:tc>
           <w:tcPr>
             <w:tcW w:w="3300" w:type="dxa"/>
@@ -7934,12 +7767,6 @@
         </w:tc>
       </w:tr>
       <w:tr>
-        <w:tblPrEx>
-          <w:tblCellMar>
-            <w:top w:w="0" w:type="dxa"/>
-            <w:bottom w:w="0" w:type="dxa"/>
-          </w:tblCellMar>
-        </w:tblPrEx>
         <w:tc>
           <w:tcPr>
             <w:tcW w:w="3300" w:type="dxa"/>
@@ -8004,12 +7831,6 @@
         </w:tc>
       </w:tr>
       <w:tr>
-        <w:tblPrEx>
-          <w:tblCellMar>
-            <w:top w:w="0" w:type="dxa"/>
-            <w:bottom w:w="0" w:type="dxa"/>
-          </w:tblCellMar>
-        </w:tblPrEx>
         <w:tc>
           <w:tcPr>
             <w:tcW w:w="3300" w:type="dxa"/>
@@ -8297,23 +8118,88 @@
         <w:spacing w:after="160" w:line="276" w:lineRule="auto"/>
       </w:pPr>
       <w:r>
-        <w:t>[Screenshot placeholder: Main interface - input section]</w:t>
-      </w:r>
-    </w:p>
-    <w:p>
-      <w:pPr>
-        <w:spacing w:after="160" w:line="276" w:lineRule="auto"/>
-      </w:pPr>
-      <w:r>
-        <w:t>[Screenshot placeholder: Loading state]</w:t>
-      </w:r>
-    </w:p>
-    <w:p>
-      <w:pPr>
-        <w:spacing w:after="160" w:line="276" w:lineRule="auto"/>
-      </w:pPr>
-      <w:r>
-        <w:t>[Screenshot placeholder: Results section with generated notes]</w:t>
+        <w:rPr>
+          <w:noProof/>
+        </w:rPr>
+        <w:lastRenderedPageBreak/>
+        <w:drawing>
+          <wp:inline distT="0" distB="0" distL="0" distR="0" wp14:anchorId="56A86EE2" wp14:editId="65B97641">
+            <wp:extent cx="5943600" cy="2787650"/>
+            <wp:effectExtent l="0" t="0" r="0" b="0"/>
+            <wp:docPr id="1022584652" name="Picture 1"/>
+            <wp:cNvGraphicFramePr>
+              <a:graphicFrameLocks xmlns:a="http://schemas.openxmlformats.org/drawingml/2006/main" noChangeAspect="1"/>
+            </wp:cNvGraphicFramePr>
+            <a:graphic xmlns:a="http://schemas.openxmlformats.org/drawingml/2006/main">
+              <a:graphicData uri="http://schemas.openxmlformats.org/drawingml/2006/picture">
+                <pic:pic xmlns:pic="http://schemas.openxmlformats.org/drawingml/2006/picture">
+                  <pic:nvPicPr>
+                    <pic:cNvPr id="894323553" name=""/>
+                    <pic:cNvPicPr/>
+                  </pic:nvPicPr>
+                  <pic:blipFill>
+                    <a:blip r:embed="rId9"/>
+                    <a:stretch>
+                      <a:fillRect/>
+                    </a:stretch>
+                  </pic:blipFill>
+                  <pic:spPr>
+                    <a:xfrm>
+                      <a:off x="0" y="0"/>
+                      <a:ext cx="5943600" cy="2787650"/>
+                    </a:xfrm>
+                    <a:prstGeom prst="rect">
+                      <a:avLst/>
+                    </a:prstGeom>
+                  </pic:spPr>
+                </pic:pic>
+              </a:graphicData>
+            </a:graphic>
+          </wp:inline>
+        </w:drawing>
+      </w:r>
+      <w:r>
+        <w:rPr>
+          <w:noProof/>
+        </w:rPr>
+        <w:drawing>
+          <wp:inline distT="0" distB="0" distL="0" distR="0" wp14:anchorId="28595401" wp14:editId="05F87119">
+            <wp:extent cx="5943600" cy="2816860"/>
+            <wp:effectExtent l="0" t="0" r="0" b="2540"/>
+            <wp:docPr id="1191643049" name="Picture 1"/>
+            <wp:cNvGraphicFramePr>
+              <a:graphicFrameLocks xmlns:a="http://schemas.openxmlformats.org/drawingml/2006/main" noChangeAspect="1"/>
+            </wp:cNvGraphicFramePr>
+            <a:graphic xmlns:a="http://schemas.openxmlformats.org/drawingml/2006/main">
+              <a:graphicData uri="http://schemas.openxmlformats.org/drawingml/2006/picture">
+                <pic:pic xmlns:pic="http://schemas.openxmlformats.org/drawingml/2006/picture">
+                  <pic:nvPicPr>
+                    <pic:cNvPr id="33132634" name=""/>
+                    <pic:cNvPicPr/>
+                  </pic:nvPicPr>
+                  <pic:blipFill>
+                    <a:blip r:embed="rId10"/>
+                    <a:stretch>
+                      <a:fillRect/>
+                    </a:stretch>
+                  </pic:blipFill>
+                  <pic:spPr>
+                    <a:xfrm>
+                      <a:off x="0" y="0"/>
+                      <a:ext cx="5943600" cy="2816860"/>
+                    </a:xfrm>
+                    <a:prstGeom prst="rect">
+                      <a:avLst/>
+                    </a:prstGeom>
+                  </pic:spPr>
+                </pic:pic>
+              </a:graphicData>
+            </a:graphic>
+          </wp:inline>
+        </w:drawing>
+      </w:r>
+      <w:r>
+        <w:t xml:space="preserve"> </w:t>
       </w:r>
     </w:p>
     <w:p>
@@ -8326,6 +8212,101 @@
         <w:pStyle w:val="Heading1"/>
       </w:pPr>
       <w:bookmarkStart w:id="34" w:name="_Toc232372150"/>
+    </w:p>
+    <w:p>
+      <w:pPr>
+        <w:pStyle w:val="Heading1"/>
+      </w:pPr>
+      <w:r>
+        <w:rPr>
+          <w:noProof/>
+        </w:rPr>
+        <w:drawing>
+          <wp:inline distT="0" distB="0" distL="0" distR="0" wp14:anchorId="4CB06F0E" wp14:editId="27D3A270">
+            <wp:extent cx="5943600" cy="4117340"/>
+            <wp:effectExtent l="0" t="0" r="0" b="0"/>
+            <wp:docPr id="1170588835" name="Picture 1"/>
+            <wp:cNvGraphicFramePr>
+              <a:graphicFrameLocks xmlns:a="http://schemas.openxmlformats.org/drawingml/2006/main" noChangeAspect="1"/>
+            </wp:cNvGraphicFramePr>
+            <a:graphic xmlns:a="http://schemas.openxmlformats.org/drawingml/2006/main">
+              <a:graphicData uri="http://schemas.openxmlformats.org/drawingml/2006/picture">
+                <pic:pic xmlns:pic="http://schemas.openxmlformats.org/drawingml/2006/picture">
+                  <pic:nvPicPr>
+                    <pic:cNvPr id="1758650043" name=""/>
+                    <pic:cNvPicPr/>
+                  </pic:nvPicPr>
+                  <pic:blipFill>
+                    <a:blip r:embed="rId11"/>
+                    <a:stretch>
+                      <a:fillRect/>
+                    </a:stretch>
+                  </pic:blipFill>
+                  <pic:spPr>
+                    <a:xfrm>
+                      <a:off x="0" y="0"/>
+                      <a:ext cx="5943600" cy="4117340"/>
+                    </a:xfrm>
+                    <a:prstGeom prst="rect">
+                      <a:avLst/>
+                    </a:prstGeom>
+                  </pic:spPr>
+                </pic:pic>
+              </a:graphicData>
+            </a:graphic>
+          </wp:inline>
+        </w:drawing>
+      </w:r>
+    </w:p>
+    <w:p>
+      <w:pPr>
+        <w:pStyle w:val="Heading1"/>
+      </w:pPr>
+    </w:p>
+    <w:p>
+      <w:pPr>
+        <w:pStyle w:val="Heading1"/>
+      </w:pPr>
+    </w:p>
+    <w:p>
+      <w:pPr>
+        <w:pStyle w:val="Heading1"/>
+      </w:pPr>
+    </w:p>
+    <w:p>
+      <w:pPr>
+        <w:pStyle w:val="Heading1"/>
+      </w:pPr>
+    </w:p>
+    <w:p>
+      <w:pPr>
+        <w:pStyle w:val="Heading1"/>
+      </w:pPr>
+    </w:p>
+    <w:p>
+      <w:pPr>
+        <w:pStyle w:val="Heading1"/>
+      </w:pPr>
+    </w:p>
+    <w:p>
+      <w:pPr>
+        <w:pStyle w:val="Heading1"/>
+      </w:pPr>
+    </w:p>
+    <w:p>
+      <w:pPr>
+        <w:pStyle w:val="Heading1"/>
+      </w:pPr>
+    </w:p>
+    <w:p>
+      <w:pPr>
+        <w:pStyle w:val="Heading1"/>
+      </w:pPr>
+    </w:p>
+    <w:p>
+      <w:pPr>
+        <w:pStyle w:val="Heading1"/>
+      </w:pPr>
       <w:r>
         <w:lastRenderedPageBreak/>
         <w:t>Project Workflow</w:t>
@@ -8367,7 +8348,7 @@
                     </pic:cNvPicPr>
                   </pic:nvPicPr>
                   <pic:blipFill>
-                    <a:blip r:embed="rId9"/>
+                    <a:blip r:embed="rId12"/>
                     <a:srcRect/>
                     <a:stretch>
                       <a:fillRect/>
@@ -8451,7 +8432,7 @@
                     </pic:cNvPicPr>
                   </pic:nvPicPr>
                   <pic:blipFill>
-                    <a:blip r:embed="rId10"/>
+                    <a:blip r:embed="rId13"/>
                     <a:srcRect/>
                     <a:stretch>
                       <a:fillRect/>
@@ -9469,7 +9450,7 @@
       <w:r>
         <w:t xml:space="preserve">The complete source code for this project, including the dataset, fine-tuning script, and web application, is publicly available on GitHub at: </w:t>
       </w:r>
-      <w:hyperlink r:id="rId11" w:history="1">
+      <w:hyperlink r:id="rId14" w:history="1">
         <w:r>
           <w:rPr>
             <w:rStyle w:val="Hyperlink"/>
@@ -9531,7 +9512,44 @@
         <w:spacing w:after="160" w:line="276" w:lineRule="auto"/>
       </w:pPr>
       <w:r>
-        <w:t>[Screenshot placeholder]</w:t>
+        <w:rPr>
+          <w:noProof/>
+        </w:rPr>
+        <w:drawing>
+          <wp:inline distT="0" distB="0" distL="0" distR="0" wp14:anchorId="59B49876" wp14:editId="521F694C">
+            <wp:extent cx="5943600" cy="2787650"/>
+            <wp:effectExtent l="0" t="0" r="0" b="0"/>
+            <wp:docPr id="894323553" name="Picture 1"/>
+            <wp:cNvGraphicFramePr>
+              <a:graphicFrameLocks xmlns:a="http://schemas.openxmlformats.org/drawingml/2006/main" noChangeAspect="1"/>
+            </wp:cNvGraphicFramePr>
+            <a:graphic xmlns:a="http://schemas.openxmlformats.org/drawingml/2006/main">
+              <a:graphicData uri="http://schemas.openxmlformats.org/drawingml/2006/picture">
+                <pic:pic xmlns:pic="http://schemas.openxmlformats.org/drawingml/2006/picture">
+                  <pic:nvPicPr>
+                    <pic:cNvPr id="894323553" name=""/>
+                    <pic:cNvPicPr/>
+                  </pic:nvPicPr>
+                  <pic:blipFill>
+                    <a:blip r:embed="rId9"/>
+                    <a:stretch>
+                      <a:fillRect/>
+                    </a:stretch>
+                  </pic:blipFill>
+                  <pic:spPr>
+                    <a:xfrm>
+                      <a:off x="0" y="0"/>
+                      <a:ext cx="5943600" cy="2787650"/>
+                    </a:xfrm>
+                    <a:prstGeom prst="rect">
+                      <a:avLst/>
+                    </a:prstGeom>
+                  </pic:spPr>
+                </pic:pic>
+              </a:graphicData>
+            </a:graphic>
+          </wp:inline>
+        </w:drawing>
       </w:r>
     </w:p>
     <w:p>
@@ -9557,7 +9575,151 @@
         <w:spacing w:after="160" w:line="276" w:lineRule="auto"/>
       </w:pPr>
       <w:r>
-        <w:t>[Screenshot placeholder]</w:t>
+        <w:rPr>
+          <w:noProof/>
+        </w:rPr>
+        <w:drawing>
+          <wp:inline distT="0" distB="0" distL="0" distR="0" wp14:anchorId="19E21E29" wp14:editId="28B69A93">
+            <wp:extent cx="5943600" cy="2816860"/>
+            <wp:effectExtent l="0" t="0" r="0" b="2540"/>
+            <wp:docPr id="33132634" name="Picture 1"/>
+            <wp:cNvGraphicFramePr>
+              <a:graphicFrameLocks xmlns:a="http://schemas.openxmlformats.org/drawingml/2006/main" noChangeAspect="1"/>
+            </wp:cNvGraphicFramePr>
+            <a:graphic xmlns:a="http://schemas.openxmlformats.org/drawingml/2006/main">
+              <a:graphicData uri="http://schemas.openxmlformats.org/drawingml/2006/picture">
+                <pic:pic xmlns:pic="http://schemas.openxmlformats.org/drawingml/2006/picture">
+                  <pic:nvPicPr>
+                    <pic:cNvPr id="33132634" name=""/>
+                    <pic:cNvPicPr/>
+                  </pic:nvPicPr>
+                  <pic:blipFill>
+                    <a:blip r:embed="rId10"/>
+                    <a:stretch>
+                      <a:fillRect/>
+                    </a:stretch>
+                  </pic:blipFill>
+                  <pic:spPr>
+                    <a:xfrm>
+                      <a:off x="0" y="0"/>
+                      <a:ext cx="5943600" cy="2816860"/>
+                    </a:xfrm>
+                    <a:prstGeom prst="rect">
+                      <a:avLst/>
+                    </a:prstGeom>
+                  </pic:spPr>
+                </pic:pic>
+              </a:graphicData>
+            </a:graphic>
+          </wp:inline>
+        </w:drawing>
+      </w:r>
+      <w:r>
+        <w:t xml:space="preserve">While the uploaded audio is being processed, the interface displays an animated spinner along </w:t>
+      </w:r>
+      <w:r>
+        <w:lastRenderedPageBreak/>
+        <w:t>with a status message that cycles between "Transcribing audio...", "Summarizing content...", and "Formatting notes..." to indicate progress to the user.</w:t>
+      </w:r>
+    </w:p>
+    <w:p>
+      <w:pPr>
+        <w:pStyle w:val="Heading2"/>
+      </w:pPr>
+      <w:bookmarkStart w:id="65" w:name="_Toc232372181"/>
+      <w:r>
+        <w:t>23.3 Generated Notes (Manual Topic)</w:t>
+      </w:r>
+      <w:bookmarkEnd w:id="65"/>
+    </w:p>
+    <w:p>
+      <w:pPr>
+        <w:pStyle w:val="Heading2"/>
+      </w:pPr>
+      <w:r>
+        <w:rPr>
+          <w:noProof/>
+        </w:rPr>
+        <w:drawing>
+          <wp:inline distT="0" distB="0" distL="0" distR="0" wp14:anchorId="15DDE924" wp14:editId="781D0444">
+            <wp:extent cx="5943600" cy="753110"/>
+            <wp:effectExtent l="0" t="0" r="0" b="8890"/>
+            <wp:docPr id="714743908" name="Picture 1"/>
+            <wp:cNvGraphicFramePr>
+              <a:graphicFrameLocks xmlns:a="http://schemas.openxmlformats.org/drawingml/2006/main" noChangeAspect="1"/>
+            </wp:cNvGraphicFramePr>
+            <a:graphic xmlns:a="http://schemas.openxmlformats.org/drawingml/2006/main">
+              <a:graphicData uri="http://schemas.openxmlformats.org/drawingml/2006/picture">
+                <pic:pic xmlns:pic="http://schemas.openxmlformats.org/drawingml/2006/picture">
+                  <pic:nvPicPr>
+                    <pic:cNvPr id="714743908" name=""/>
+                    <pic:cNvPicPr/>
+                  </pic:nvPicPr>
+                  <pic:blipFill>
+                    <a:blip r:embed="rId15"/>
+                    <a:stretch>
+                      <a:fillRect/>
+                    </a:stretch>
+                  </pic:blipFill>
+                  <pic:spPr>
+                    <a:xfrm>
+                      <a:off x="0" y="0"/>
+                      <a:ext cx="5943600" cy="753110"/>
+                    </a:xfrm>
+                    <a:prstGeom prst="rect">
+                      <a:avLst/>
+                    </a:prstGeom>
+                  </pic:spPr>
+                </pic:pic>
+              </a:graphicData>
+            </a:graphic>
+          </wp:inline>
+        </w:drawing>
+      </w:r>
+    </w:p>
+    <w:p>
+      <w:pPr>
+        <w:pStyle w:val="Heading2"/>
+      </w:pPr>
+      <w:r>
+        <w:rPr>
+          <w:noProof/>
+        </w:rPr>
+        <w:drawing>
+          <wp:inline distT="0" distB="0" distL="0" distR="0" wp14:anchorId="171FDA96" wp14:editId="6EA93B28">
+            <wp:extent cx="5943600" cy="4117340"/>
+            <wp:effectExtent l="0" t="0" r="0" b="0"/>
+            <wp:docPr id="1758650043" name="Picture 1"/>
+            <wp:cNvGraphicFramePr>
+              <a:graphicFrameLocks xmlns:a="http://schemas.openxmlformats.org/drawingml/2006/main" noChangeAspect="1"/>
+            </wp:cNvGraphicFramePr>
+            <a:graphic xmlns:a="http://schemas.openxmlformats.org/drawingml/2006/main">
+              <a:graphicData uri="http://schemas.openxmlformats.org/drawingml/2006/picture">
+                <pic:pic xmlns:pic="http://schemas.openxmlformats.org/drawingml/2006/picture">
+                  <pic:nvPicPr>
+                    <pic:cNvPr id="1758650043" name=""/>
+                    <pic:cNvPicPr/>
+                  </pic:nvPicPr>
+                  <pic:blipFill>
+                    <a:blip r:embed="rId11"/>
+                    <a:stretch>
+                      <a:fillRect/>
+                    </a:stretch>
+                  </pic:blipFill>
+                  <pic:spPr>
+                    <a:xfrm>
+                      <a:off x="0" y="0"/>
+                      <a:ext cx="5943600" cy="4117340"/>
+                    </a:xfrm>
+                    <a:prstGeom prst="rect">
+                      <a:avLst/>
+                    </a:prstGeom>
+                  </pic:spPr>
+                </pic:pic>
+              </a:graphicData>
+            </a:graphic>
+          </wp:inline>
+        </w:drawing>
       </w:r>
     </w:p>
     <w:p>
@@ -9565,111 +9727,237 @@
         <w:spacing w:after="160" w:line="276" w:lineRule="auto"/>
       </w:pPr>
       <w:r>
-        <w:t>While the uploaded audio is being processed, the interface displays an animated spinner along with a status message that cycles between "Transcribing audio...", "Summarizing content...", and "Formatting notes..." to indicate progress to the user.</w:t>
+        <w:t>When a topic name (for example, "Neural Networks") is supplied by the user, the generated notes display this topic as the title, followed by the transcript, a bulleted list of key points extracted from the summary, and a list of detected key terms such as "Neural Network", "Deep Learning", and "Backpropagation".</w:t>
       </w:r>
     </w:p>
     <w:p>
       <w:pPr>
         <w:pStyle w:val="Heading2"/>
       </w:pPr>
-      <w:bookmarkStart w:id="65" w:name="_Toc232372181"/>
-      <w:r>
-        <w:t>23.3 Generated Notes (Manual Topic)</w:t>
-      </w:r>
-      <w:bookmarkEnd w:id="65"/>
+      <w:bookmarkStart w:id="66" w:name="_Toc232372182"/>
+      <w:r>
+        <w:t>23.4 Generated Notes (Automatic Title)</w:t>
+      </w:r>
+      <w:bookmarkEnd w:id="66"/>
     </w:p>
     <w:p>
       <w:pPr>
         <w:spacing w:after="160" w:line="276" w:lineRule="auto"/>
       </w:pPr>
       <w:r>
-        <w:t>[Screenshot placeholder]</w:t>
+        <w:rPr>
+          <w:noProof/>
+        </w:rPr>
+        <w:drawing>
+          <wp:inline distT="0" distB="0" distL="0" distR="0" wp14:anchorId="6448DCB9" wp14:editId="7815431E">
+            <wp:extent cx="5943600" cy="811530"/>
+            <wp:effectExtent l="0" t="0" r="0" b="7620"/>
+            <wp:docPr id="1074109006" name="Picture 1"/>
+            <wp:cNvGraphicFramePr>
+              <a:graphicFrameLocks xmlns:a="http://schemas.openxmlformats.org/drawingml/2006/main" noChangeAspect="1"/>
+            </wp:cNvGraphicFramePr>
+            <a:graphic xmlns:a="http://schemas.openxmlformats.org/drawingml/2006/main">
+              <a:graphicData uri="http://schemas.openxmlformats.org/drawingml/2006/picture">
+                <pic:pic xmlns:pic="http://schemas.openxmlformats.org/drawingml/2006/picture">
+                  <pic:nvPicPr>
+                    <pic:cNvPr id="1074109006" name=""/>
+                    <pic:cNvPicPr/>
+                  </pic:nvPicPr>
+                  <pic:blipFill>
+                    <a:blip r:embed="rId16"/>
+                    <a:stretch>
+                      <a:fillRect/>
+                    </a:stretch>
+                  </pic:blipFill>
+                  <pic:spPr>
+                    <a:xfrm>
+                      <a:off x="0" y="0"/>
+                      <a:ext cx="5943600" cy="811530"/>
+                    </a:xfrm>
+                    <a:prstGeom prst="rect">
+                      <a:avLst/>
+                    </a:prstGeom>
+                  </pic:spPr>
+                </pic:pic>
+              </a:graphicData>
+            </a:graphic>
+          </wp:inline>
+        </w:drawing>
       </w:r>
     </w:p>
     <w:p>
       <w:pPr>
         <w:spacing w:after="160" w:line="276" w:lineRule="auto"/>
       </w:pPr>
-      <w:r>
-        <w:t>When a topic name (for example, "Neural Networks") is supplied by the user, the generated notes display this topic as the title, followed by the transcript, a bulleted list of key points extracted from the summary, and a list of detected key terms such as "Neural Network", "Deep Learning", and "Backpropagation".</w:t>
+    </w:p>
+    <w:p>
+      <w:pPr>
+        <w:spacing w:after="160" w:line="276" w:lineRule="auto"/>
+      </w:pPr>
+      <w:r>
+        <w:rPr>
+          <w:noProof/>
+        </w:rPr>
+        <w:lastRenderedPageBreak/>
+        <w:drawing>
+          <wp:inline distT="0" distB="0" distL="0" distR="0" wp14:anchorId="37B10A41" wp14:editId="286C551F">
+            <wp:extent cx="5943600" cy="3960495"/>
+            <wp:effectExtent l="0" t="0" r="0" b="1905"/>
+            <wp:docPr id="1752055689" name="Picture 1"/>
+            <wp:cNvGraphicFramePr>
+              <a:graphicFrameLocks xmlns:a="http://schemas.openxmlformats.org/drawingml/2006/main" noChangeAspect="1"/>
+            </wp:cNvGraphicFramePr>
+            <a:graphic xmlns:a="http://schemas.openxmlformats.org/drawingml/2006/main">
+              <a:graphicData uri="http://schemas.openxmlformats.org/drawingml/2006/picture">
+                <pic:pic xmlns:pic="http://schemas.openxmlformats.org/drawingml/2006/picture">
+                  <pic:nvPicPr>
+                    <pic:cNvPr id="1752055689" name=""/>
+                    <pic:cNvPicPr/>
+                  </pic:nvPicPr>
+                  <pic:blipFill>
+                    <a:blip r:embed="rId17"/>
+                    <a:stretch>
+                      <a:fillRect/>
+                    </a:stretch>
+                  </pic:blipFill>
+                  <pic:spPr>
+                    <a:xfrm>
+                      <a:off x="0" y="0"/>
+                      <a:ext cx="5943600" cy="3960495"/>
+                    </a:xfrm>
+                    <a:prstGeom prst="rect">
+                      <a:avLst/>
+                    </a:prstGeom>
+                  </pic:spPr>
+                </pic:pic>
+              </a:graphicData>
+            </a:graphic>
+          </wp:inline>
+        </w:drawing>
+      </w:r>
+    </w:p>
+    <w:p>
+      <w:pPr>
+        <w:spacing w:after="160" w:line="276" w:lineRule="auto"/>
+      </w:pPr>
+      <w:r>
+        <w:t>When the topic field is left empty, the system automatically generates a relevant title based on the content of the summary, demonstrating the automatic title generation feature described in Section 19.4.</w:t>
       </w:r>
     </w:p>
     <w:p>
       <w:pPr>
         <w:pStyle w:val="Heading2"/>
       </w:pPr>
-      <w:bookmarkStart w:id="66" w:name="_Toc232372182"/>
-      <w:r>
-        <w:t>23.4 Generated Notes (Automatic Title)</w:t>
-      </w:r>
-      <w:bookmarkEnd w:id="66"/>
+      <w:bookmarkStart w:id="67" w:name="_Toc232372183"/>
+      <w:r>
+        <w:t>23.5 Export Function</w:t>
+      </w:r>
+      <w:bookmarkEnd w:id="67"/>
     </w:p>
     <w:p>
       <w:pPr>
         <w:spacing w:after="160" w:line="276" w:lineRule="auto"/>
       </w:pPr>
       <w:r>
-        <w:t>[Screenshot placeholder]</w:t>
-      </w:r>
+        <w:rPr>
+          <w:noProof/>
+        </w:rPr>
+        <w:lastRenderedPageBreak/>
+        <w:drawing>
+          <wp:inline distT="0" distB="0" distL="0" distR="0" wp14:anchorId="3F27669C" wp14:editId="293D6B86">
+            <wp:extent cx="5943600" cy="3364865"/>
+            <wp:effectExtent l="0" t="0" r="0" b="6985"/>
+            <wp:docPr id="1017901661" name="Picture 1"/>
+            <wp:cNvGraphicFramePr>
+              <a:graphicFrameLocks xmlns:a="http://schemas.openxmlformats.org/drawingml/2006/main" noChangeAspect="1"/>
+            </wp:cNvGraphicFramePr>
+            <a:graphic xmlns:a="http://schemas.openxmlformats.org/drawingml/2006/main">
+              <a:graphicData uri="http://schemas.openxmlformats.org/drawingml/2006/picture">
+                <pic:pic xmlns:pic="http://schemas.openxmlformats.org/drawingml/2006/picture">
+                  <pic:nvPicPr>
+                    <pic:cNvPr id="1017901661" name=""/>
+                    <pic:cNvPicPr/>
+                  </pic:nvPicPr>
+                  <pic:blipFill>
+                    <a:blip r:embed="rId18"/>
+                    <a:stretch>
+                      <a:fillRect/>
+                    </a:stretch>
+                  </pic:blipFill>
+                  <pic:spPr>
+                    <a:xfrm>
+                      <a:off x="0" y="0"/>
+                      <a:ext cx="5943600" cy="3364865"/>
+                    </a:xfrm>
+                    <a:prstGeom prst="rect">
+                      <a:avLst/>
+                    </a:prstGeom>
+                  </pic:spPr>
+                </pic:pic>
+              </a:graphicData>
+            </a:graphic>
+          </wp:inline>
+        </w:drawing>
+      </w:r>
+      <w:r>
+        <w:t>Clicking the "Export" button downloads the generated notes as a plain text (.txt) file, which can be opened in any text editor or imported into note-taking applications.</w:t>
+      </w:r>
+    </w:p>
+    <w:p>
+      <w:pPr>
+        <w:pStyle w:val="Heading2"/>
+      </w:pPr>
+      <w:bookmarkStart w:id="68" w:name="_Toc232372184"/>
+      <w:r>
+        <w:t>23.6 Project Repository on GitHub</w:t>
+      </w:r>
+      <w:bookmarkEnd w:id="68"/>
     </w:p>
     <w:p>
       <w:pPr>
         <w:spacing w:after="160" w:line="276" w:lineRule="auto"/>
       </w:pPr>
       <w:r>
-        <w:t>When the topic field is left empty, the system automatically generates a relevant title based on the content of the summary, demonstrating the automatic title generation feature described in Section 19.4.</w:t>
-      </w:r>
-    </w:p>
-    <w:p>
-      <w:pPr>
-        <w:pStyle w:val="Heading2"/>
-      </w:pPr>
-      <w:bookmarkStart w:id="67" w:name="_Toc232372183"/>
-      <w:r>
-        <w:t>23.5 Export Function</w:t>
-      </w:r>
-      <w:bookmarkEnd w:id="67"/>
-    </w:p>
-    <w:p>
-      <w:pPr>
-        <w:spacing w:after="160" w:line="276" w:lineRule="auto"/>
-      </w:pPr>
-      <w:r>
-        <w:t>[Screenshot placeholder]</w:t>
-      </w:r>
-    </w:p>
-    <w:p>
-      <w:pPr>
-        <w:spacing w:after="160" w:line="276" w:lineRule="auto"/>
-      </w:pPr>
-      <w:r>
-        <w:t>Clicking the "Export" button downloads the generated notes as a plain text (.txt) file, which can be opened in any text editor or imported into note-taking applications.</w:t>
-      </w:r>
-    </w:p>
-    <w:p>
-      <w:pPr>
-        <w:pStyle w:val="Heading2"/>
-      </w:pPr>
-      <w:bookmarkStart w:id="68" w:name="_Toc232372184"/>
-      <w:r>
-        <w:t>23.6 Project Repository on GitHub</w:t>
-      </w:r>
-      <w:bookmarkEnd w:id="68"/>
-    </w:p>
-    <w:p>
-      <w:pPr>
-        <w:spacing w:after="160" w:line="276" w:lineRule="auto"/>
-      </w:pPr>
-      <w:r>
-        <w:t>[Screenshot placeholder]</w:t>
-      </w:r>
-    </w:p>
-    <w:p>
-      <w:pPr>
-        <w:spacing w:after="160" w:line="276" w:lineRule="auto"/>
-      </w:pPr>
-      <w:r>
-        <w:lastRenderedPageBreak/>
+        <w:rPr>
+          <w:noProof/>
+        </w:rPr>
+        <w:drawing>
+          <wp:inline distT="0" distB="0" distL="0" distR="0" wp14:anchorId="3CDF5988" wp14:editId="474320CC">
+            <wp:extent cx="5943600" cy="2802255"/>
+            <wp:effectExtent l="0" t="0" r="0" b="0"/>
+            <wp:docPr id="196009492" name="Picture 1"/>
+            <wp:cNvGraphicFramePr>
+              <a:graphicFrameLocks xmlns:a="http://schemas.openxmlformats.org/drawingml/2006/main" noChangeAspect="1"/>
+            </wp:cNvGraphicFramePr>
+            <a:graphic xmlns:a="http://schemas.openxmlformats.org/drawingml/2006/main">
+              <a:graphicData uri="http://schemas.openxmlformats.org/drawingml/2006/picture">
+                <pic:pic xmlns:pic="http://schemas.openxmlformats.org/drawingml/2006/picture">
+                  <pic:nvPicPr>
+                    <pic:cNvPr id="196009492" name=""/>
+                    <pic:cNvPicPr/>
+                  </pic:nvPicPr>
+                  <pic:blipFill>
+                    <a:blip r:embed="rId19"/>
+                    <a:stretch>
+                      <a:fillRect/>
+                    </a:stretch>
+                  </pic:blipFill>
+                  <pic:spPr>
+                    <a:xfrm>
+                      <a:off x="0" y="0"/>
+                      <a:ext cx="5943600" cy="2802255"/>
+                    </a:xfrm>
+                    <a:prstGeom prst="rect">
+                      <a:avLst/>
+                    </a:prstGeom>
+                  </pic:spPr>
+                </pic:pic>
+              </a:graphicData>
+            </a:graphic>
+          </wp:inline>
+        </w:drawing>
+      </w:r>
+      <w:r>
         <w:t xml:space="preserve">The project's GitHub repository contains the complete, version-controlled source code, a README file describing the project and providing setup instructions, and </w:t>
       </w:r>
       <w:proofErr w:type="gramStart"/>
@@ -9992,7 +10280,7 @@
       <w:r>
         <w:t xml:space="preserve">[7] Project source code repository: </w:t>
       </w:r>
-      <w:hyperlink r:id="rId12" w:history="1">
+      <w:hyperlink r:id="rId20" w:history="1">
         <w:r>
           <w:rPr>
             <w:rStyle w:val="Hyperlink"/>
@@ -10002,8 +10290,8 @@
       </w:hyperlink>
     </w:p>
     <w:sectPr>
-      <w:headerReference w:type="default" r:id="rId13"/>
-      <w:footerReference w:type="default" r:id="rId14"/>
+      <w:headerReference w:type="default" r:id="rId21"/>
+      <w:footerReference w:type="default" r:id="rId22"/>
       <w:pgSz w:w="12240" w:h="15840"/>
       <w:pgMar w:top="1440" w:right="1440" w:bottom="1440" w:left="1440" w:header="720" w:footer="720" w:gutter="0"/>
       <w:pgBorders w:offsetFrom="page">

</xml_diff>